<commit_message>
Remove the author-contributions declaration from the current paper
Omit the complete declaration from the maintained source builder and rebuild
the current PDF/DOCX, publication model and reproducibility archive. Preserve
the historical baseline and all experimental evidence. Keep the Word
references heading with its first entry after the resulting pagination change.

Verify exactly one paragraph was removed: all other 188 paragraphs, 17
tables, 10 figure byte streams, title, author list and references are unchanged.
Inspect all 12 changed page images; the other 43 match inspected versions.
Both renderings retain their 27/28 page counts and have no replacement glyphs.

All 44 publication tests, independent numerical-table checks and package
correspondence pass; all 1,922 baseline evidence files retain their bytes.
</commit_message>
<xml_diff>
--- a/paper/Revon Research Paper Springer.docx
+++ b/paper/Revon Research Paper Springer.docx
@@ -18253,24 +18253,6 @@
           <w:color w:val="000000"/>
           <w:sz w:val="22"/>
         </w:rPr>
-        <w:t>Author contributions: Atharva Sheersh Pandey performed 80% of the research work, and Adhyan Jain performed 20%. Guidance and critical review were provided by Poornima Nedunchezhian.</w:t>
-      </w:r>
-    </w:p>
-    <w:p>
-      <w:pPr>
-        <w:keepNext w:val="0"/>
-        <w:pageBreakBefore w:val="0"/>
-        <w:widowControl/>
-        <w:spacing w:line="259" w:lineRule="exact" w:before="0" w:after="0"/>
-        <w:ind w:firstLine="239"/>
-        <w:jc w:val="both"/>
-      </w:pPr>
-      <w:r>
-        <w:rPr>
-          <w:rFonts w:ascii="TeXGyreTermesX" w:hAnsi="TeXGyreTermesX"/>
-          <w:color w:val="000000"/>
-          <w:sz w:val="22"/>
-        </w:rPr>
         <w:t>Ethics and consent to participate: This computational study recruited no participants and performed no human or animal intervention. It uses synthetic histories and publicly released de-identified TLC records. We make no claim of institutional ethics approval or exemption.</w:t>
       </w:r>
     </w:p>
@@ -18379,7 +18361,7 @@
     <w:p>
       <w:pPr>
         <w:pStyle w:val="Heading1"/>
-        <w:keepNext w:val="0"/>
+        <w:keepNext/>
         <w:pageBreakBefore w:val="0"/>
         <w:widowControl/>
         <w:spacing w:line="259" w:lineRule="exact" w:before="320" w:after="160"/>

</xml_diff>

<commit_message>
Present Windows experiments as part of the unpublished Revon study
Replace draft-stage descriptions of a new Windows study or local revision
with direct platform and experiment-scope wording throughout the manuscript.
Rename section 6 to Windows Evaluation Results and identify the Wine Quality
and CO2 sources directly in the abstract and conclusion.

Rebuild the PDF, editable Word companion, reviewed publication model and
reproducibility archive. Preserve all numerical values, 17 table cell sets,
10 figure images, 33 references and frozen experimental evidence.

Verify the complete publication gate and audited numeric tables; inspect all
35 changed rendered pages across both formats. Retain the 27/28 page counts
and record updated artifact hashes and editorial verification.
</commit_message>
<xml_diff>
--- a/paper/Revon Research Paper Springer.docx
+++ b/paper/Revon Research Paper Springer.docx
@@ -149,7 +149,7 @@
           <w:rFonts w:ascii="TeXGyreTermesX" w:hAnsi="TeXGyreTermesX"/>
           <w:sz w:val="18"/>
         </w:rPr>
-        <w:t>Revon is a Python prototype for durable, linear-history key/value versioning. We study the choice between log aggregation and hash-pruned comparison over the same SQLite-backed fixed-depth Merkle trie. The contribution is a controlled evaluation of this choice and its workflow costs, rather than a new index or general-purpose database. We retain an author-run Linux evaluation of the JSON-repaired implementation: 516 executions and a separate 72-execution geometry/telemetry supplement. Eight of nine paired hybrid/Merkle timing intervals favour hybrid, while the dense case includes parity. A frozen threshold nevertheless selects a slower path in a separate control. A new Windows study adds 93 fresh-worker cases, disjoint calibration and validation histories, controlled sensitivity experiments, two further public source families and repeated 100,000/1,000,000-record runs. Its largest threshold candidate wins calibration and uses log throughout the tested intervals; this does not establish a benefit from switching or an optimal crossover. Published CO2 revisions provide observed record changes, while wine corrections remain generated. We report algorithm behaviour, CLI execution phases and whole-worker resources separately. All new outputs and historical states are checked against semantic oracles. The results describe bounded versioning workflows on the recorded machines; they establish neither storage-engine superiority nor independent-party reproduction.</w:t>
+        <w:t>Revon is a Python prototype for durable, linear-history key/value versioning. We study the choice between log aggregation and hash-pruned comparison over the same SQLite-backed fixed-depth Merkle trie. The contribution is a controlled evaluation of this choice and its workflow costs, rather than a new index or general-purpose database. Our author-run Linux evaluation of the JSON-repaired implementation comprises 516 executions and a separate 72-execution geometry/telemetry supplement. Eight of nine paired hybrid/Merkle timing intervals favour hybrid, while the dense case includes parity. A frozen threshold nevertheless selects a slower path in a separate control. The Windows evaluation comprises 93 cases, each run in a fresh worker process, with disjoint calibration and validation histories, controlled sensitivity experiments, Wine Quality and CO2 public sources, and repeated runs at 100,000 and 1,000,000 records. Its largest threshold candidate wins calibration and uses log throughout the tested intervals; this does not establish a benefit from switching or an optimal crossover. Published CO2 revisions provide observed record changes, while wine corrections remain generated. We report algorithm behaviour, CLI execution phases and whole-worker resources separately. All measured outputs and historical states are checked against semantic oracles. The results describe bounded versioning workflows on the recorded machines; they establish neither storage-engine superiority nor independent-party reproduction.</w:t>
       </w:r>
       <w:r>
         <w:rPr>
@@ -329,7 +329,7 @@
           <w:color w:val="000000"/>
           <w:sz w:val="22"/>
         </w:rPr>
-        <w:t>Policy contribution: we specify and test an interpretable operation-count rule against its forced-path controls. A new calibration choice is frozen before held-out evaluation; adverse choices and the possibility that always-log suffices are retained.</w:t>
+        <w:t>Policy contribution: we specify and test an interpretable operation-count rule against its forced-path controls. The calibration choice is frozen before held-out evaluation; adverse choices and the possibility that always-log suffices are retained.</w:t>
       </w:r>
     </w:p>
     <w:p>
@@ -365,7 +365,7 @@
           <w:color w:val="000000"/>
           <w:sz w:val="22"/>
         </w:rPr>
-        <w:t>Evaluation contribution: the author-run Linux campaigns remain separate from a new 93-case Windows study with disjoint seeds, matched sensitivity controls, two additional public source families and repeated scale observations. No timing rows are pooled across these campaigns.</w:t>
+        <w:t>Evaluation contribution: the author-run Linux campaigns are analysed separately from the 93-case Windows evaluation with disjoint seeds, matched sensitivity controls, Wine Quality and CO2 public sources and repeated scale observations. No timing rows are pooled across these campaigns.</w:t>
       </w:r>
     </w:p>
     <w:p>
@@ -1714,7 +1714,7 @@
           <w:color w:val="000000"/>
           <w:sz w:val="22"/>
         </w:rPr>
-        <w:t>We compare two correct diff paths over the same durable history, choosing a path from properties of the requested interval. Every Revon-H commit retains a Merkle root and an addressed changeset, so selection leaves version semantics unchanged. Our hypothesis is that log aggregation works well for short, sparse intervals, whereas hash pruning may be useful after longer sequences of operations. Whether the paths cross in performance requires measurement; the switching rule alone cannot establish it. Git4Data illustrates continuing work on database-native version control [17]. Our contribution is confined to adaptive differencing over a fixed-depth hash trie, with Snapshot and Log-only serving as representation baselines. Revon is not a general-purpose data-versioning platform. The retained Linux public-record extension uses generated updates to one TLC release. The separate local revision adds wine corrections and an observed CO2 publication sequence. These bounded sources do not establish performance across diverse domains, independent hardware, concurrent workloads or production systems.</w:t>
+        <w:t>We compare two correct diff paths over the same durable history, choosing a path from properties of the requested interval. Every Revon-H commit retains a Merkle root and an addressed changeset, so selection leaves version semantics unchanged. Our hypothesis is that log aggregation works well for short, sparse intervals, whereas hash pruning may be useful after longer sequences of operations. Whether the paths cross in performance requires measurement; the switching rule alone cannot establish it. Git4Data illustrates continuing work on database-native version control [17]. Our contribution is confined to adaptive differencing over a fixed-depth hash trie, with Snapshot and Log-only serving as representation baselines. Revon is not a general-purpose data-versioning platform. The retained Linux public-record extension uses generated updates to one TLC release. The Windows evaluation uses generated wine corrections and an observed CO2 publication sequence. These bounded sources do not establish performance across diverse domains, independent hardware, concurrent workloads or production systems.</w:t>
       </w:r>
     </w:p>
     <w:p>
@@ -2949,7 +2949,7 @@
           <w:color w:val="000000"/>
           <w:sz w:val="22"/>
         </w:rPr>
-        <w:t>The retained primary campaign ran on a separate Ubuntu n2-standard-4 cloud VM; Table 3 identifies its environment and two source snapshots. The review revision uses the authorised Windows host only. Differences in hardware, OS, runtime and storage remain confounded, and neither campaign is an independent-party reproduction.</w:t>
+        <w:t>The retained primary campaign ran on a separate Ubuntu n2-standard-4 cloud VM; Table 3 identifies its environment and two source snapshots. The Windows campaign ran on a separate author-operated host. Differences in hardware, OS, runtime and storage remain confounded, and neither campaign is an independent-party reproduction.</w:t>
       </w:r>
     </w:p>
     <w:p>
@@ -3568,7 +3568,7 @@
           <w:color w:val="000000"/>
           <w:sz w:val="22"/>
         </w:rPr>
-        <w:t>Each campaign retains source hashes, a frozen protocol, environment records, correctness proofs and raw observations. The Linux preflight gates passed 67 and 69 tests; the new local gate passed 77. Packaging failures and the public-data premeasurement exclusion remain documented. Detailed records and commands are described in Appendices A and B.</w:t>
+        <w:t>Each campaign retains source hashes, a frozen protocol, environment records, correctness proofs and raw observations. The Linux preflight gates passed 67 and 69 tests; the Windows preflight gate passed 77. Packaging failures and the public-data premeasurement exclusion remain documented. Detailed records and commands are described in Appendices A and B.</w:t>
       </w:r>
     </w:p>
     <w:p>
@@ -5541,7 +5541,7 @@
           <w:color w:val="000000"/>
           <w:sz w:val="22"/>
         </w:rPr>
-        <w:t>The historical Linux estimates use seven fresh-repository trials and paired percentile-bootstrap timing intervals for fixed histories. The new study instead records seven cached queries within each fresh repository and reports independent-history or repository medians separately. These experimental units are not interchangeable; neither estimates a population of machines.</w:t>
+        <w:t>The historical Linux estimates use seven fresh-repository trials and paired percentile-bootstrap timing intervals for fixed histories. The Windows campaign records seven cached queries within each fresh repository and reports independent-history or repository medians separately. These experimental units are not interchangeable; neither estimates a population of machines.</w:t>
       </w:r>
     </w:p>
     <w:p>
@@ -5559,7 +5559,7 @@
           <w:color w:val="000000"/>
           <w:sz w:val="22"/>
         </w:rPr>
-        <w:t>Resource sampling covers the worker and observed descendants, including setup and verification. It is not product-only memory or operation-only CPU. The primary Linux read-counter ambiguity is retained; the later supplement and new sampler distinguish supported zero counters from missing counters. Windows process I/O bytes are not direct physical-disk traffic.</w:t>
+        <w:t>Resource sampling covers the worker and observed descendants, including setup and verification. It is not product-only memory or operation-only CPU. The primary Linux read-counter ambiguity is retained; the Linux supplement and Windows sampler distinguish supported zero counters from missing counters. Windows process I/O bytes are not direct physical-disk traffic.</w:t>
       </w:r>
     </w:p>
     <w:p>
@@ -5577,7 +5577,7 @@
           <w:color w:val="000000"/>
           <w:sz w:val="22"/>
         </w:rPr>
-        <w:t>Repository footprint measures persistent files, including metadata and representation costs. The old Linux measurement is taken before closing/compacting; the new local measurement follows close and the specified verification steps. These differently conditioned values are not pooled or interpreted as pure tree overhead.</w:t>
+        <w:t>Repository footprint measures persistent files, including metadata and representation costs. The Linux measurement is taken before closing/compacting; the Windows measurement follows close and the specified verification steps. These differently conditioned values are not pooled or interpreted as pure tree overhead.</w:t>
       </w:r>
     </w:p>
     <w:p>
@@ -5605,7 +5605,7 @@
           <w:color w:val="000000"/>
           <w:sz w:val="22"/>
         </w:rPr>
-        <w:t>An existing Windows calibration/held-out study selected the largest candidate, T=16,384; it did not identify a crossover. The Linux threshold controls preserve that choice. The new review campaign uses a separately frozen design, source snapshot and disjoint seeds, described below; it does not replace any older threshold result.</w:t>
+        <w:t>An existing Windows calibration/held-out study selected the largest candidate, T=16,384; it did not identify a crossover. The Linux threshold controls preserve that choice. The Windows campaign uses a separately frozen design, source snapshot and disjoint seeds, described below; its threshold results are analysed separately.</w:t>
       </w:r>
     </w:p>
     <w:p>
@@ -5623,7 +5623,7 @@
           <w:color w:val="000000"/>
           <w:sz w:val="22"/>
         </w:rPr>
-        <w:t>The retained Linux controls compare forced log, forced Merkle and T=16,384 hybrid at 8,192 and 32,768 operations over 10,000 rows. The new measurements do not retune these controls.</w:t>
+        <w:t>The retained Linux controls compare forced log, forced Merkle and T=16,384 hybrid at 8,192 and 32,768 operations over 10,000 rows. The Windows measurements do not retune these controls.</w:t>
       </w:r>
     </w:p>
     <w:p>
@@ -11269,7 +11269,7 @@
           <w:color w:val="000000"/>
           <w:sz w:val="22"/>
         </w:rPr>
-        <w:t>In the retained Linux million-row diagnostic, we create and verify one fresh repository for each of M, H and Dolt. Verification checks all eleven historical states and the common diff oracle. Table 10 reports the individual observations, with no IQRs, confidence intervals or performance ranking. Because the interval contains 10,000 accumulated operations, exceeding T=4,096, H uses Merkle. Each run demonstrates completion of this bounded workload on the VM. One run per system cannot establish reliable relative scaling or identify an optimal configuration; the new repeated local scale runs are reported separately in Section 6.4.</w:t>
+        <w:t>In the retained Linux million-row diagnostic, we create and verify one fresh repository for each of M, H and Dolt. Verification checks all eleven historical states and the common diff oracle. Table 10 reports the individual observations, with no IQRs, confidence intervals or performance ranking. Because the interval contains 10,000 accumulated operations, exceeding T=4,096, H uses Merkle. Each run demonstrates completion of this bounded workload on the VM. One run per system cannot establish reliable relative scaling or identify an optimal configuration; the repeated Windows scale runs are reported separately in Section 6.4.</w:t>
       </w:r>
     </w:p>
     <w:p>
@@ -14610,7 +14610,7 @@
           <w:i w:val="0"/>
           <w:sz w:val="22"/>
         </w:rPr>
-        <w:t xml:space="preserve">6. Local Revision Results.  </w:t>
+        <w:t xml:space="preserve">6. Windows Evaluation Results.  </w:t>
       </w:r>
     </w:p>
     <w:p>
@@ -17944,7 +17944,7 @@
           <w:color w:val="000000"/>
           <w:sz w:val="22"/>
         </w:rPr>
-        <w:t>The repeated local runs add evidence at scale without upgrading the old Linux diagnostics. The three generated histories share the same initial synthetic distribution and differ in updates; they are not three independent public datasets. Memory availability and background processes are recorded in the manifest, not controlled away. These observations support conditional descriptions of the measured workflows, not a population-level ranking or a general scaling law.</w:t>
+        <w:t>The repeated Windows scale runs are analysed separately from the Linux diagnostics. The three generated histories share the same initial synthetic distribution and differ in updates; they are not three independent public datasets. Memory availability and background processes are recorded in the manifest, not controlled away. These observations support conditional descriptions of the measured workflows, not a population-level ranking or a general scaling law.</w:t>
       </w:r>
     </w:p>
     <w:p>
@@ -17971,7 +17971,7 @@
           <w:color w:val="000000"/>
           <w:sz w:val="22"/>
         </w:rPr>
-        <w:t>RQ1: the workflow measurements expose latency, persistence and worker-resource trade-offs, with API/CLI costs still preventing an engine-only ranking. RQ2: some fixed histories benefit from log relative to forced Merkle, but the new calibration winner uses log everywhere tested; optimal switching remains unestablished. RQ3: controlled sensitivity histories make payload, routing and geometry effects visible within the tested design, without identifying a universally best layout. Observed CO2 transitions broaden revision realism, while generated wine and synthetic histories retain their own scope limits.</w:t>
+        <w:t>RQ1: the workflow measurements expose latency, persistence and worker-resource trade-offs, with API/CLI costs still preventing an engine-only ranking. RQ2: some fixed histories benefit from log relative to forced Merkle, but the Windows calibration winner uses log everywhere tested; optimal switching remains unestablished. RQ3: controlled sensitivity histories make payload, routing and geometry effects visible within the tested design, without identifying a universally best layout. Observed CO2 transitions broaden revision realism, while generated wine and synthetic histories retain their own scope limits.</w:t>
       </w:r>
     </w:p>
     <w:p>
@@ -18017,7 +18017,7 @@
           <w:color w:val="000000"/>
           <w:sz w:val="22"/>
         </w:rPr>
-        <w:t>RQ2 concerns transfer to unseen histories, not merely repeated timing of one history. The new split controls primary N, H, payload and geometry and freezes selection before validation. Its largest candidate behaves as always-log within the measured interval range. The adverse Linux selection and dense-case parity remain useful counterexamples. A more complex selector would require new calibration and untouched testing; these results do not justify adding complexity or changing the production threshold.</w:t>
+        <w:t>RQ2 concerns transfer to unseen histories, not merely repeated timing of one history. The Windows split controls primary N, H, payload and geometry and freezes selection before validation. Its largest candidate behaves as always-log within the measured interval range. The adverse Linux selection and dense-case parity remain useful counterexamples. A more complex selector would require new calibration and untouched testing; these results do not justify adding complexity or changing the production threshold.</w:t>
       </w:r>
     </w:p>
     <w:p>
@@ -18035,7 +18035,7 @@
           <w:color w:val="000000"/>
           <w:sz w:val="22"/>
         </w:rPr>
-        <w:t>RQ3 concerns controlled changes to the fixed trie and its workload. Equal-capacity geometries can differ in traversal depth and ancestor reconstruction while having equal expected occupancy under uniform routing. Payload encoding, touched leaves and output materialisation also contribute. The new sensitivity set adds independent seeds and matched controls to the old one-history geometry study, but does not estimate every factor interaction or a population optimum.</w:t>
+        <w:t>RQ3 concerns controlled changes to the fixed trie and its workload. Equal-capacity geometries can differ in traversal depth and ancestor reconstruction while having equal expected occupancy under uniform routing. Payload encoding, touched leaves and output materialisation also contribute. The Windows sensitivity set uses independent seeds and matched controls alongside the Linux study of one fixed history, but does not estimate every factor interaction or a population optimum.</w:t>
       </w:r>
     </w:p>
     <w:p>
@@ -18081,7 +18081,7 @@
           <w:color w:val="000000"/>
           <w:sz w:val="22"/>
         </w:rPr>
-        <w:t>External validity: Linux results come from one author-run cloud VM, and the new results from one author-run Windows host. The new local study is not another Linux or independent-party replication. Hardware, OS, runtime, virtualization and storage vary together between campaigns. Background services and filesystem caching remain active; the local manifest records limited available RAM and process conditions. No entirely idle, cold-cache or OS-causal claim follows.</w:t>
+        <w:t>External validity: Linux results come from one author-run cloud VM, and Windows results from one author-run host. Both campaigns were conducted by the authors; the Windows campaign does not reproduce the Linux environment. Hardware, OS, runtime, virtualization and storage vary together between campaigns. Background services and filesystem caching remain active; the local manifest records limited available RAM and process conditions. No entirely idle, cold-cache or OS-causal claim follows.</w:t>
       </w:r>
     </w:p>
     <w:p>
@@ -18099,7 +18099,7 @@
           <w:color w:val="000000"/>
           <w:sz w:val="22"/>
         </w:rPr>
-        <w:t>Workload validity: the original TLC histories remain generated from one monthly release, with n=1 Linux scale diagnostics. The new study adds three held-out generated seeds per primary profile, generated wine corrections and one observed CO2 publication sequence. Three CO2 repositories repeat that sequence rather than independently sampling its history. A header-only upstream revision is excluded before timing, and unnamed columns are retained without scientific interpretation. Repeated synthetic scale histories broaden observations but share their initial distribution. More domains, observed histories and hardware are still needed for broad generalisation.</w:t>
+        <w:t>Workload validity: the original TLC histories remain generated from one monthly release, with n=1 Linux scale diagnostics. The Windows evaluation includes three held-out generated seeds per primary profile, generated wine corrections and one observed CO2 publication sequence. Three CO2 repositories repeat that sequence rather than independently sampling its history. A header-only upstream revision is excluded before timing, and unnamed columns are retained without scientific interpretation. Repeated synthetic scale histories broaden observations but share their initial distribution. More domains, observed histories and hardware are still needed for broad generalisation.</w:t>
       </w:r>
     </w:p>
     <w:p>
@@ -18135,7 +18135,7 @@
           <w:color w:val="000000"/>
           <w:sz w:val="22"/>
         </w:rPr>
-        <w:t>Measurement and inference: process startup, native work and JSON emission remain combined in Dolt's command interval. Whole-worker RSS includes oracle/history state and is not product-only memory. Ten-millisecond sampling can miss short-lived processes, and Windows I/O counters do not identify physical-disk or database logical reads. The off/on sampler diagnostic also confounds execution order and cache state. The historical bootstrap intervals concern fixed-history timings; new three-history ranges are descriptive and have no multiple-comparison correction. Source and semantic-hash checks establish internal consistency, not independent performance reproduction.</w:t>
+        <w:t>Measurement and inference: process startup, native work and JSON emission remain combined in Dolt's command interval. Whole-worker RSS includes oracle/history state and is not product-only memory. Ten-millisecond sampling can miss short-lived processes, and Windows I/O counters do not identify physical-disk or database logical reads. The off/on sampler diagnostic also confounds execution order and cache state. The historical bootstrap intervals concern fixed-history timings; Windows three-history ranges are descriptive and have no multiple-comparison correction. Source and semantic-hash checks establish internal consistency, not independent performance reproduction.</w:t>
       </w:r>
     </w:p>
     <w:p>
@@ -18199,7 +18199,7 @@
           <w:color w:val="000000"/>
           <w:sz w:val="22"/>
         </w:rPr>
-        <w:t>Revon integrates established fixed-trie content addressing, changesets and atomic SQLite persistence to expose two semantically consistent ways to compute a version diff. The retained Linux evidence comprises 516 executions and a 72-execution supplement, including dense-case uncertainty and an adverse threshold choice. A separate local revision completes 93 worker cases and 3,402 checked queries, with held-out generated histories, two further public source families, interface-phase measurements and repeated scale observations. Calibration selects T=65,536, which behaves as always-log in this matrix and does not establish optimal switching. The new evidence improves control and breadth while retaining API/CLI, sampling, dataset and hardware limits. The contribution is an auditable prototype and a bounded empirical trade-off study; a new general-purpose database, universal speed advantage and independent-party reproduction are not established.</w:t>
+        <w:t>Revon integrates established fixed-trie content addressing, changesets and atomic SQLite persistence to expose two semantically consistent ways to compute a version diff. The retained Linux evidence comprises 516 executions and a 72-execution supplement, including dense-case uncertainty and an adverse threshold choice. The Windows evaluation comprises 93 worker cases and 3,402 checked queries, with held-out generated histories, Wine Quality and CO2 public sources, interface-phase measurements and repeated scale observations. Calibration selects T=65,536, which behaves as always-log in this matrix and does not establish optimal switching. The combined evaluation covers controlled workload variations and public data while retaining API/CLI, sampling, dataset and hardware limits. The contribution is an auditable prototype and a bounded empirical trade-off study; a new general-purpose database, universal speed advantage and independent-party reproduction are not established.</w:t>
       </w:r>
     </w:p>
     <w:p>
@@ -18308,7 +18308,7 @@
           <w:color w:val="000000"/>
           <w:sz w:val="22"/>
         </w:rPr>
-        <w:t xml:space="preserve">. The current review archive is </w:t>
+        <w:t xml:space="preserve">. The Windows reproducibility archive is </w:t>
       </w:r>
       <w:hyperlink r:id="rId25">
         <w:r>
@@ -19373,7 +19373,7 @@
           <w:color w:val="000000"/>
           <w:sz w:val="22"/>
         </w:rPr>
-        <w:t xml:space="preserve">, which retains the separate local review campaign, source snapshots, raw observations, protocols and internal audits. The README files explain dependency setup, public-source acquisition, execution and verification [1]. Repository updates do not replace the frozen source inside an experiment bundle.</w:t>
+        <w:t xml:space="preserve">, which retains the Windows campaign, source snapshots, raw observations, protocols and internal audits. The README files explain dependency setup, public-source acquisition, execution and verification [1]. Repository updates do not replace the frozen source inside an experiment bundle.</w:t>
       </w:r>
     </w:p>
     <w:p>
@@ -19391,7 +19391,7 @@
           <w:color w:val="000000"/>
           <w:sz w:val="22"/>
         </w:rPr>
-        <w:t>The two Linux bundles and the local Windows review study belong to different campaigns and must not be pooled. Original TLC records and generated repositories are rebuilt using the recorded preparation steps. The local public-source manifest records licences, acquisition versions, checksums and the premeasurement CO2 exclusion. Auditors run on disposable copies with localised data paths, preserving collected bytes. Internal audits do not independently reproduce timing; matching semantic hashes do not guarantee identical elapsed times.</w:t>
+        <w:t>The two Linux bundles and the Windows study belong to different campaigns and must not be pooled. Original TLC records and generated repositories are rebuilt using the recorded preparation steps. The local public-source manifest records licences, acquisition versions, checksums and the premeasurement CO2 exclusion. Auditors run on disposable copies with localised data paths, preserving collected bytes. Internal audits do not independently reproduce timing; matching semantic hashes do not guarantee identical elapsed times.</w:t>
       </w:r>
     </w:p>
     <w:p>
@@ -19596,7 +19596,7 @@
           <w:color w:val="000000"/>
           <w:sz w:val="22"/>
         </w:rPr>
-        <w:t>New Dolt instrumentation invokes the same native JSON-diff command and parser contract as the baseline adapter, with explicit phase timers. A preflight compares its actual output against the native adapter and the independent semantic oracle. New Revon queries verify observed output hashes, all historical state hashes, reverse/identity requests, object integrity and reopen behaviour outside timing. Failed setup checks and data-quality exclusions precede measurement and remain documented. The exact query matrix and timing source hashes are retained; changed source requires a different campaign.</w:t>
+        <w:t>The Windows Dolt instrumentation invokes the same native JSON-diff command and parser contract as the baseline adapter, with explicit phase timers. A preflight compares its actual output against the native adapter and the independent semantic oracle. The Windows Revon queries verify observed output hashes, all historical state hashes, reverse/identity requests, object integrity and reopen behaviour outside timing. Failed setup checks and data-quality exclusions precede measurement and remain documented. The exact query matrix and timing source hashes are retained; changed source requires a different campaign.</w:t>
       </w:r>
     </w:p>
     <w:p>
@@ -20051,7 +20051,7 @@
         </w:rPr>
         <w:t>Table 17</w:t>
         <w:br/>
-        <w:t>Local review campaign; cached queries are distinct from independent history or repository repetitions</w:t>
+        <w:t>Windows experiment matrix; cached queries are distinct from independent history or repository repetitions</w:t>
       </w:r>
     </w:p>
     <w:tbl>

</xml_diff>